<commit_message>
feat(math): update 19C explanation/variants, archive number-line HTML handout, and render markdown headings in wrongbook docx
</commit_message>
<xml_diff>
--- a/02_数学/错题集/输出/数学_错题练习_参考答案与讲解.docx
+++ b/02_数学/错题集/输出/数学_错题练习_参考答案与讲解.docx
@@ -27,7 +27,7 @@
           <w:color w:val="707070"/>
           <w:sz w:val="18"/>
         </w:rPr>
-        <w:t>朱秋宇 · 七年级  |  共 3 题  |  生成日期：2026-10-28</w:t>
+        <w:t>朱秋宇 · 七年级  |  共 3 题  |  生成日期：2026-10-29</w:t>
       </w:r>
     </w:p>
     <w:p>
@@ -303,7 +303,20 @@
           <w:color w:val="408040"/>
           <w:sz w:val="17"/>
         </w:rPr>
-        <w:t>（✓ 2026-10-28 双法复核：①通式 2a+4b+8c = 2×6+4×4+8×3 = 52；②枚举八面体对偶图 384 棵生成树取最大权 26，栅格化数外围边 = 52。）</w:t>
+        <w:t>（✓ 2026-10-29 三法复核：①整体等式 96−2×23=50；②十字形展开图逐面数边 6+13+10+10+11+0=50；③对偶图 384 棵生成树穷举（min 50 / max 62，公式 2a+4b+8c、8a+4b+2c）；变式 (6,5,3)=56、(5,4,h→2) min 42 / max 60 均与穷举一致。）</w:t>
+      </w:r>
+    </w:p>
+    <w:p>
+      <w:pPr>
+        <w:spacing w:before="100" w:after="40"/>
+      </w:pPr>
+      <w:r>
+        <w:rPr>
+          <w:rFonts w:ascii="黑体" w:hAnsi="黑体" w:eastAsia="黑体"/>
+          <w:b/>
+          <w:sz w:val="21"/>
+        </w:rPr>
+        <w:t>结论</w:t>
       </w:r>
     </w:p>
     <w:p>
@@ -317,7 +330,20 @@
           <w:b w:val="0"/>
           <w:sz w:val="21"/>
         </w:rPr>
-        <w:t>6 个面的周长之和 = 2×2×(5+4) + 2×2×(5+3) + 2×2×(4+3) = 96 cm。</w:t>
+        <w:t>50 cm（与台账参考答案一致）</w:t>
+      </w:r>
+    </w:p>
+    <w:p>
+      <w:pPr>
+        <w:spacing w:before="100" w:after="40"/>
+      </w:pPr>
+      <w:r>
+        <w:rPr>
+          <w:rFonts w:ascii="黑体" w:hAnsi="黑体" w:eastAsia="黑体"/>
+          <w:b/>
+          <w:sz w:val="21"/>
+        </w:rPr>
+        <w:t>一、教材定位</w:t>
       </w:r>
     </w:p>
     <w:p>
@@ -331,7 +357,7 @@
           <w:b w:val="0"/>
           <w:sz w:val="21"/>
         </w:rPr>
-        <w:t>展开图由 6 个面组成，必须保留 5 条棱不剪（这 5 条棱把 6 个面连成一棵没有环的“连接树”），其余 7 条棱剪开。</w:t>
+        <w:t>北师大版七年级上册 第一章《丰富的图形世界》第 2 节「从立体图形到平面图形」（展开与折叠）。</w:t>
       </w:r>
     </w:p>
     <w:p>
@@ -345,7 +371,7 @@
           <w:b w:val="0"/>
           <w:sz w:val="21"/>
         </w:rPr>
-        <w:t>展开图外围周长 = 2×剪开棱长之和 = 面周长之和 − 2×未剪棱长之和。</w:t>
+        <w:t>核心两条：①6 个面要连成一张不断开的平面图，未剪的棱必须把 6 个面连成一棵“树”——正好 5 条，且不能成环；②每剪开一条长 L 的棱，展开图外边界上就出现两条长 L 的边，所以</w:t>
       </w:r>
     </w:p>
     <w:p>
@@ -359,7 +385,20 @@
           <w:b w:val="0"/>
           <w:sz w:val="21"/>
         </w:rPr>
-        <w:t>12 条棱中，4 条长 5、4 条长 4、4 条长 3；枚举“未剪的 5 条棱”的可行组合，未剪棱长之和最大为 5+5+5+4+4=23。</w:t>
+        <w:t>外围周长 = 2 × 剪开棱长之和 = 6 个面周长之和 − 2 × 未剪棱长之和。</w:t>
+      </w:r>
+    </w:p>
+    <w:p>
+      <w:pPr>
+        <w:spacing w:before="100" w:after="40"/>
+      </w:pPr>
+      <w:r>
+        <w:rPr>
+          <w:rFonts w:ascii="黑体" w:hAnsi="黑体" w:eastAsia="黑体"/>
+          <w:b/>
+          <w:sz w:val="21"/>
+        </w:rPr>
+        <w:t>二、为什么“同一方向最多留 3 条”</w:t>
       </w:r>
     </w:p>
     <w:p>
@@ -373,7 +412,7 @@
           <w:b w:val="0"/>
           <w:sz w:val="21"/>
         </w:rPr>
-        <w:t>所以最小外围周长 = 96 − 2×23 = 50 cm。</w:t>
+        <w:t>把 6 个面看成 6 个点、每条棱看成连接相邻两个面的边。同一方向的 4 条棱，在这张“面—面相邻”图里正好围成一个 4 环；未剪的 5 条棱必须连成树（无环），所以同一方向最多留 3 条。</w:t>
       </w:r>
     </w:p>
     <w:p>
@@ -387,7 +426,200 @@
           <w:b w:val="0"/>
           <w:sz w:val="21"/>
         </w:rPr>
-        <w:t>等价验证：总棱长 = 4×(5+4+3)=48 cm，剪开棱长和 = 48−23=25 cm，周长 = 2×25 = 50 cm。</w:t>
+        <w:t>（注意：不是“4 条同向棱在长方体上首尾相接”，长方体上同向的 4 条棱是互相平行的；成环是在“面—面连接”这层关系里。）</w:t>
+      </w:r>
+    </w:p>
+    <w:p>
+      <w:pPr>
+        <w:spacing w:before="100" w:after="40"/>
+      </w:pPr>
+      <w:r>
+        <w:rPr>
+          <w:rFonts w:ascii="黑体" w:hAnsi="黑体" w:eastAsia="黑体"/>
+          <w:b/>
+          <w:sz w:val="21"/>
+        </w:rPr>
+        <w:t>三、分步推导</w:t>
+      </w:r>
+    </w:p>
+    <w:p>
+      <w:pPr>
+        <w:spacing w:after="60"/>
+        <w:ind w:firstLine="420"/>
+      </w:pPr>
+      <w:r>
+        <w:rPr>
+          <w:rFonts w:ascii="宋体" w:hAnsi="宋体" w:eastAsia="宋体"/>
+          <w:b w:val="0"/>
+          <w:sz w:val="21"/>
+        </w:rPr>
+        <w:t>1. 6 个面周长之和 = 2×2(5+4) + 2×2(5+3) + 2×2(4+3) = 36 + 32 + 28 = 96 cm。</w:t>
+      </w:r>
+    </w:p>
+    <w:p>
+      <w:pPr>
+        <w:spacing w:after="60"/>
+        <w:ind w:firstLine="420"/>
+      </w:pPr>
+      <w:r>
+        <w:rPr>
+          <w:rFonts w:ascii="宋体" w:hAnsi="宋体" w:eastAsia="宋体"/>
+          <w:b w:val="0"/>
+          <w:sz w:val="21"/>
+        </w:rPr>
+        <w:t>2. 12 条棱：4 条长 5、4 条长 4、4 条长 3。</w:t>
+      </w:r>
+    </w:p>
+    <w:p>
+      <w:pPr>
+        <w:spacing w:after="60"/>
+        <w:ind w:firstLine="420"/>
+      </w:pPr>
+      <w:r>
+        <w:rPr>
+          <w:rFonts w:ascii="宋体" w:hAnsi="宋体" w:eastAsia="宋体"/>
+          <w:b w:val="0"/>
+          <w:sz w:val="21"/>
+        </w:rPr>
+        <w:t>3. 要让外围周长最小，“减去的部分”就要最大，即未剪的 5 条棱尽量长：同向最多 3 条，取 5 + 5 + 5 + 4 + 4 = 23 cm。</w:t>
+      </w:r>
+    </w:p>
+    <w:p>
+      <w:pPr>
+        <w:spacing w:after="60"/>
+        <w:ind w:firstLine="420"/>
+      </w:pPr>
+      <w:r>
+        <w:rPr>
+          <w:rFonts w:ascii="宋体" w:hAnsi="宋体" w:eastAsia="宋体"/>
+          <w:b w:val="0"/>
+          <w:sz w:val="21"/>
+        </w:rPr>
+        <w:t>4. 最小外围周长 = 96 − 2×23 = 50 cm。</w:t>
+      </w:r>
+    </w:p>
+    <w:p>
+      <w:pPr>
+        <w:spacing w:after="60"/>
+        <w:ind w:firstLine="420"/>
+      </w:pPr>
+      <w:r>
+        <w:rPr>
+          <w:rFonts w:ascii="宋体" w:hAnsi="宋体" w:eastAsia="宋体"/>
+          <w:b w:val="0"/>
+          <w:sz w:val="21"/>
+        </w:rPr>
+        <w:t xml:space="preserve">   等价算法：总棱长 4(5+4+3) = 48，剪开棱长和 = 48 − 23 = 25，周长 = 2×25 = 50 cm。</w:t>
+      </w:r>
+    </w:p>
+    <w:p>
+      <w:pPr>
+        <w:spacing w:before="100" w:after="40"/>
+      </w:pPr>
+      <w:r>
+        <w:rPr>
+          <w:rFonts w:ascii="黑体" w:hAnsi="黑体" w:eastAsia="黑体"/>
+          <w:b/>
+          <w:sz w:val="21"/>
+        </w:rPr>
+        <w:t>四、双方法核验</w:t>
+      </w:r>
+    </w:p>
+    <w:p>
+      <w:pPr>
+        <w:spacing w:after="60"/>
+        <w:ind w:firstLine="420"/>
+      </w:pPr>
+      <w:r>
+        <w:rPr>
+          <w:rFonts w:ascii="宋体" w:hAnsi="宋体" w:eastAsia="宋体"/>
+          <w:b w:val="0"/>
+          <w:sz w:val="21"/>
+        </w:rPr>
+        <w:t>方法一（整体等式法）：96 − 2×23 = 50。</w:t>
+      </w:r>
+    </w:p>
+    <w:p>
+      <w:pPr>
+        <w:spacing w:after="60"/>
+        <w:ind w:firstLine="420"/>
+      </w:pPr>
+      <w:r>
+        <w:rPr>
+          <w:rFonts w:ascii="宋体" w:hAnsi="宋体" w:eastAsia="宋体"/>
+          <w:b w:val="0"/>
+          <w:sz w:val="21"/>
+        </w:rPr>
+        <w:t>方法二（构造十字形展开图逐面数边）：前面 6 + 上面 13 + 左面 10 + 右面 10 + 后面 11 + 底面 0 = 50 cm。</w:t>
+      </w:r>
+    </w:p>
+    <w:p>
+      <w:pPr>
+        <w:spacing w:after="60"/>
+        <w:ind w:firstLine="420"/>
+      </w:pPr>
+      <w:r>
+        <w:rPr>
+          <w:rFonts w:ascii="宋体" w:hAnsi="宋体" w:eastAsia="宋体"/>
+          <w:b w:val="0"/>
+          <w:sz w:val="21"/>
+        </w:rPr>
+        <w:t>方法三（程序穷举）：对偶图 384 棵生成树穷举，未剪棱长和最大 23、最小 17，对应外围周长最小 50、最大 62 cm，与通式一致。</w:t>
+      </w:r>
+    </w:p>
+    <w:p>
+      <w:pPr>
+        <w:spacing w:before="100" w:after="40"/>
+      </w:pPr>
+      <w:r>
+        <w:rPr>
+          <w:rFonts w:ascii="黑体" w:hAnsi="黑体" w:eastAsia="黑体"/>
+          <w:b/>
+          <w:sz w:val="21"/>
+        </w:rPr>
+        <w:t>五、通式与口诀（a≥b≥c）</w:t>
+      </w:r>
+    </w:p>
+    <w:p>
+      <w:pPr>
+        <w:spacing w:after="60"/>
+        <w:ind w:firstLine="420"/>
+      </w:pPr>
+      <w:r>
+        <w:rPr>
+          <w:rFonts w:ascii="宋体" w:hAnsi="宋体" w:eastAsia="宋体"/>
+          <w:b w:val="0"/>
+          <w:sz w:val="21"/>
+        </w:rPr>
+        <w:t>最小外围周长 = 2a + 4b + 8c；最大外围周长 = 8a + 4b + 2c。</w:t>
+      </w:r>
+    </w:p>
+    <w:p>
+      <w:pPr>
+        <w:spacing w:after="60"/>
+        <w:ind w:firstLine="420"/>
+      </w:pPr>
+      <w:r>
+        <w:rPr>
+          <w:rFonts w:ascii="宋体" w:hAnsi="宋体" w:eastAsia="宋体"/>
+          <w:b w:val="0"/>
+          <w:sz w:val="21"/>
+        </w:rPr>
+        <w:t>本题：2×5 + 4×4 + 8×3 = 50 ✓；8×5 + 4×4 + 2×3 = 62 cm（最大值，可作反向练习）。</w:t>
+      </w:r>
+    </w:p>
+    <w:p>
+      <w:pPr>
+        <w:spacing w:after="60"/>
+        <w:ind w:firstLine="420"/>
+      </w:pPr>
+      <w:r>
+        <w:rPr>
+          <w:rFonts w:ascii="宋体" w:hAnsi="宋体" w:eastAsia="宋体"/>
+          <w:b w:val="0"/>
+          <w:sz w:val="21"/>
+        </w:rPr>
+        <w:t>口诀：周长不数外轮廓，先看剪开几条棱；一条棱剪开露两面，周长 = 2×剪棱和。想最小就留长棱，同向四条只能留三。</w:t>
       </w:r>
     </w:p>
     <w:p>
@@ -441,7 +673,7 @@
           <w:b w:val="0"/>
           <w:sz w:val="20"/>
         </w:rPr>
-        <w:t>把长、宽、高换成 6 cm、4 cm、3 cm，再做一遍：</w:t>
+        <w:t>【变式 1（同考点换数据）】长 6 cm、宽 5 cm、高 3 cm 的长方体，表面沿棱剪开成平面展开图，外围周长最小是多少？</w:t>
       </w:r>
     </w:p>
     <w:p>
@@ -455,7 +687,7 @@
           <w:b w:val="0"/>
           <w:sz w:val="20"/>
         </w:rPr>
-        <w:t>面周长之和 = 2×2(6+4) + 2×2(6+3) + 2×2(4+3) = 40+36+28 = 104 cm；</w:t>
+        <w:t>解：六面周长和 = 2×2(6+5) + 2×2(6+3) + 2×2(5+3) = 44 + 36 + 32 = 112 cm；未剪 5 条棱取 3×6 + 2×5 = 28 cm（同向最多 3 条）；最小周长 = 112 − 2×28 = 56 cm。通式核验：2×6 + 4×5 + 8×3 = 56 ✓</w:t>
       </w:r>
     </w:p>
     <w:p>
@@ -469,7 +701,7 @@
           <w:b w:val="0"/>
           <w:sz w:val="20"/>
         </w:rPr>
-        <w:t>12 条棱 = 4 条 6 + 4 条 4 + 4 条 3；未剪的 5 条棱最大取 3×6 + 2×4 = 26（4 条长 6 的棱构成一个四边环，最多只能取 3 条，否则连成环而不是树）；</w:t>
+        <w:t>【变式 2（逆向设问）】长 5 cm、宽 4 cm、高 h cm（h 为正整数且 h &lt; 4）的长方体，展开图外围周长最小值为 42 cm，求 h；再求这个长方体展开图外围周长的最大值。</w:t>
       </w:r>
     </w:p>
     <w:p>
@@ -483,7 +715,7 @@
           <w:b w:val="0"/>
           <w:sz w:val="20"/>
         </w:rPr>
-        <w:t>最小外围周长 = 104 − 2×26 = 52 cm。</w:t>
+        <w:t>解：2×5 + 4×4 + 8h = 26 + 8h = 42 ⟹ h = 2 cm。最大值 = 8×5 + 4×4 + 2×2 = 60 cm。（穷举核验：h=2 时 min 42、max 60 ✓）</w:t>
       </w:r>
     </w:p>
     <w:p>
@@ -497,7 +729,7 @@
           <w:b w:val="0"/>
           <w:sz w:val="20"/>
         </w:rPr>
-        <w:t>通式（长≥宽≥高为 a≥b≥c）：最小外围周长 = 2a + 4b + 8c。</w:t>
+        <w:t>【此前变式（保留）】长 6、宽 4、高 3：六面周长和 = 104 cm，未剪取 3×6 + 2×4 = 26，最小周长 = 104 − 52 = 52 cm。</w:t>
       </w:r>
     </w:p>
     <w:p>

</xml_diff>